<commit_message>
Checking No. of Changes of single day class and revision_Monday_04th May
</commit_message>
<xml_diff>
--- a/DayWise Codes.docx
+++ b/DayWise Codes.docx
@@ -35061,14 +35061,7 @@
           <w:b/>
           <w:bCs/>
         </w:rPr>
-        <w:t xml:space="preserve"> Class</w:t>
-      </w:r>
-      <w:r>
-        <w:rPr>
-          <w:b/>
-          <w:bCs/>
-        </w:rPr>
-        <w:t>)</w:t>
+        <w:t xml:space="preserve"> Class)</w:t>
       </w:r>
     </w:p>
     <w:p>
@@ -39819,6 +39812,2247 @@
       </w:pPr>
     </w:p>
     <w:p/>
+    <w:p>
+      <w:pPr>
+        <w:jc w:val="center"/>
+        <w:rPr>
+          <w:b/>
+          <w:bCs/>
+        </w:rPr>
+      </w:pPr>
+      <w:r>
+        <w:rPr>
+          <w:b/>
+          <w:bCs/>
+        </w:rPr>
+        <w:t>Day 35_30th April</w:t>
+      </w:r>
+    </w:p>
+    <w:p>
+      <w:pPr>
+        <w:rPr>
+          <w:b/>
+          <w:bCs/>
+        </w:rPr>
+      </w:pPr>
+      <w:r>
+        <w:rPr>
+          <w:b/>
+          <w:bCs/>
+        </w:rPr>
+        <w:t xml:space="preserve">Issues with Interface Java 1.8 </w:t>
+      </w:r>
+      <w:proofErr w:type="spellStart"/>
+      <w:r>
+        <w:rPr>
+          <w:b/>
+          <w:bCs/>
+        </w:rPr>
+        <w:t>oOR</w:t>
+      </w:r>
+      <w:proofErr w:type="spellEnd"/>
+      <w:r>
+        <w:rPr>
+          <w:b/>
+          <w:bCs/>
+        </w:rPr>
+        <w:t xml:space="preserve"> 8 – </w:t>
+      </w:r>
+    </w:p>
+    <w:p>
+      <w:pPr>
+        <w:rPr>
+          <w:b/>
+          <w:bCs/>
+        </w:rPr>
+      </w:pPr>
+      <w:proofErr w:type="spellStart"/>
+      <w:r>
+        <w:rPr>
+          <w:b/>
+          <w:bCs/>
+        </w:rPr>
+        <w:t>TryingInterfaceIssues</w:t>
+      </w:r>
+      <w:proofErr w:type="spellEnd"/>
+    </w:p>
+    <w:p>
+      <w:r>
+        <w:rPr>
+          <w:b/>
+          <w:bCs/>
+        </w:rPr>
+        <w:t>package</w:t>
+      </w:r>
+      <w:r>
+        <w:t xml:space="preserve"> </w:t>
+      </w:r>
+      <w:proofErr w:type="gramStart"/>
+      <w:r>
+        <w:t>com.Revision.D</w:t>
+      </w:r>
+      <w:proofErr w:type="gramEnd"/>
+      <w:r>
+        <w:t>35;</w:t>
+      </w:r>
+    </w:p>
+    <w:p/>
+    <w:p>
+      <w:r>
+        <w:rPr>
+          <w:b/>
+          <w:bCs/>
+        </w:rPr>
+        <w:t>interface</w:t>
+      </w:r>
+      <w:r>
+        <w:t xml:space="preserve"> </w:t>
+      </w:r>
+      <w:proofErr w:type="spellStart"/>
+      <w:r>
+        <w:t>ISellingSystem</w:t>
+      </w:r>
+      <w:proofErr w:type="spellEnd"/>
+      <w:r>
+        <w:t xml:space="preserve"> {</w:t>
+      </w:r>
+    </w:p>
+    <w:p>
+      <w:r>
+        <w:tab/>
+      </w:r>
+      <w:r>
+        <w:rPr>
+          <w:b/>
+          <w:bCs/>
+        </w:rPr>
+        <w:t>void</w:t>
+      </w:r>
+      <w:r>
+        <w:t xml:space="preserve"> </w:t>
+      </w:r>
+      <w:proofErr w:type="gramStart"/>
+      <w:r>
+        <w:t>sales(</w:t>
+      </w:r>
+      <w:proofErr w:type="gramEnd"/>
+      <w:r>
+        <w:t>);</w:t>
+      </w:r>
+    </w:p>
+    <w:p/>
+    <w:p>
+      <w:r>
+        <w:tab/>
+      </w:r>
+      <w:r>
+        <w:rPr>
+          <w:b/>
+          <w:bCs/>
+        </w:rPr>
+        <w:t>void</w:t>
+      </w:r>
+      <w:r>
+        <w:t xml:space="preserve"> </w:t>
+      </w:r>
+      <w:proofErr w:type="gramStart"/>
+      <w:r>
+        <w:t>marketing(</w:t>
+      </w:r>
+      <w:proofErr w:type="gramEnd"/>
+      <w:r>
+        <w:t>);</w:t>
+      </w:r>
+    </w:p>
+    <w:p/>
+    <w:p>
+      <w:r>
+        <w:tab/>
+      </w:r>
+      <w:r>
+        <w:rPr>
+          <w:b/>
+          <w:bCs/>
+        </w:rPr>
+        <w:t>public</w:t>
+      </w:r>
+      <w:r>
+        <w:t xml:space="preserve"> </w:t>
+      </w:r>
+      <w:r>
+        <w:rPr>
+          <w:b/>
+          <w:bCs/>
+        </w:rPr>
+        <w:t>static</w:t>
+      </w:r>
+      <w:r>
+        <w:t xml:space="preserve"> </w:t>
+      </w:r>
+      <w:r>
+        <w:rPr>
+          <w:b/>
+          <w:bCs/>
+        </w:rPr>
+        <w:t>void</w:t>
+      </w:r>
+      <w:r>
+        <w:t xml:space="preserve"> </w:t>
+      </w:r>
+      <w:proofErr w:type="gramStart"/>
+      <w:r>
+        <w:t>strategies(</w:t>
+      </w:r>
+      <w:proofErr w:type="gramEnd"/>
+      <w:r>
+        <w:t>) {</w:t>
+      </w:r>
+    </w:p>
+    <w:p>
+      <w:r>
+        <w:tab/>
+      </w:r>
+      <w:r>
+        <w:tab/>
+      </w:r>
+      <w:proofErr w:type="spellStart"/>
+      <w:r>
+        <w:t>System.</w:t>
+      </w:r>
+      <w:r>
+        <w:rPr>
+          <w:b/>
+          <w:bCs/>
+          <w:i/>
+          <w:iCs/>
+        </w:rPr>
+        <w:t>out</w:t>
+      </w:r>
+      <w:r>
+        <w:t>.println</w:t>
+      </w:r>
+      <w:proofErr w:type="spellEnd"/>
+      <w:r>
+        <w:t>("</w:t>
+      </w:r>
+      <w:proofErr w:type="spellStart"/>
+      <w:r>
+        <w:t>SellingSystem.strategies</w:t>
+      </w:r>
+      <w:proofErr w:type="spellEnd"/>
+      <w:r>
+        <w:t>()");</w:t>
+      </w:r>
+    </w:p>
+    <w:p>
+      <w:r>
+        <w:tab/>
+      </w:r>
+      <w:r>
+        <w:tab/>
+      </w:r>
+      <w:proofErr w:type="spellStart"/>
+      <w:r>
+        <w:t>System.</w:t>
+      </w:r>
+      <w:r>
+        <w:rPr>
+          <w:b/>
+          <w:bCs/>
+          <w:i/>
+          <w:iCs/>
+        </w:rPr>
+        <w:t>out</w:t>
+      </w:r>
+      <w:r>
+        <w:t>.println</w:t>
+      </w:r>
+      <w:proofErr w:type="spellEnd"/>
+      <w:r>
+        <w:t xml:space="preserve">("This is </w:t>
+      </w:r>
+      <w:proofErr w:type="spellStart"/>
+      <w:r>
+        <w:t>alsmost</w:t>
+      </w:r>
+      <w:proofErr w:type="spellEnd"/>
+      <w:r>
+        <w:t xml:space="preserve"> similar for all, so need to change and write again and again");</w:t>
+      </w:r>
+    </w:p>
+    <w:p>
+      <w:r>
+        <w:tab/>
+        <w:t>}</w:t>
+      </w:r>
+    </w:p>
+    <w:p/>
+    <w:p>
+      <w:r>
+        <w:lastRenderedPageBreak/>
+        <w:tab/>
+      </w:r>
+      <w:r>
+        <w:rPr>
+          <w:b/>
+          <w:bCs/>
+        </w:rPr>
+        <w:t>public</w:t>
+      </w:r>
+      <w:r>
+        <w:t xml:space="preserve"> </w:t>
+      </w:r>
+      <w:r>
+        <w:rPr>
+          <w:b/>
+          <w:bCs/>
+        </w:rPr>
+        <w:t>static</w:t>
+      </w:r>
+      <w:r>
+        <w:t xml:space="preserve"> </w:t>
+      </w:r>
+      <w:r>
+        <w:rPr>
+          <w:b/>
+          <w:bCs/>
+        </w:rPr>
+        <w:t>void</w:t>
+      </w:r>
+      <w:r>
+        <w:t xml:space="preserve"> </w:t>
+      </w:r>
+      <w:proofErr w:type="spellStart"/>
+      <w:proofErr w:type="gramStart"/>
+      <w:r>
+        <w:t>networkingSkills</w:t>
+      </w:r>
+      <w:proofErr w:type="spellEnd"/>
+      <w:r>
+        <w:t>(</w:t>
+      </w:r>
+      <w:proofErr w:type="gramEnd"/>
+      <w:r>
+        <w:t>) {</w:t>
+      </w:r>
+    </w:p>
+    <w:p>
+      <w:r>
+        <w:tab/>
+      </w:r>
+      <w:r>
+        <w:tab/>
+      </w:r>
+      <w:proofErr w:type="spellStart"/>
+      <w:r>
+        <w:t>System.</w:t>
+      </w:r>
+      <w:r>
+        <w:rPr>
+          <w:b/>
+          <w:bCs/>
+          <w:i/>
+          <w:iCs/>
+        </w:rPr>
+        <w:t>out</w:t>
+      </w:r>
+      <w:r>
+        <w:t>.println</w:t>
+      </w:r>
+      <w:proofErr w:type="spellEnd"/>
+      <w:r>
+        <w:t>("</w:t>
+      </w:r>
+      <w:proofErr w:type="spellStart"/>
+      <w:r>
+        <w:t>SellingSystem.networkingSkills</w:t>
+      </w:r>
+      <w:proofErr w:type="spellEnd"/>
+      <w:r>
+        <w:t>()");</w:t>
+      </w:r>
+    </w:p>
+    <w:p>
+      <w:r>
+        <w:tab/>
+      </w:r>
+      <w:r>
+        <w:tab/>
+      </w:r>
+      <w:proofErr w:type="spellStart"/>
+      <w:r>
+        <w:t>System.</w:t>
+      </w:r>
+      <w:r>
+        <w:rPr>
+          <w:b/>
+          <w:bCs/>
+          <w:i/>
+          <w:iCs/>
+        </w:rPr>
+        <w:t>out</w:t>
+      </w:r>
+      <w:r>
+        <w:t>.println</w:t>
+      </w:r>
+      <w:proofErr w:type="spellEnd"/>
+      <w:r>
+        <w:t xml:space="preserve">("This is </w:t>
+      </w:r>
+      <w:proofErr w:type="gramStart"/>
+      <w:r>
+        <w:t>a  common</w:t>
+      </w:r>
+      <w:proofErr w:type="gramEnd"/>
+      <w:r>
+        <w:t xml:space="preserve"> message required by everyone, so can be print in one time and then provide reusability");</w:t>
+      </w:r>
+    </w:p>
+    <w:p>
+      <w:r>
+        <w:tab/>
+        <w:t>}</w:t>
+      </w:r>
+    </w:p>
+    <w:p/>
+    <w:p>
+      <w:r>
+        <w:t>}</w:t>
+      </w:r>
+    </w:p>
+    <w:p/>
+    <w:p>
+      <w:r>
+        <w:rPr>
+          <w:b/>
+          <w:bCs/>
+        </w:rPr>
+        <w:t>class</w:t>
+      </w:r>
+      <w:r>
+        <w:t xml:space="preserve"> B2BCompanies </w:t>
+      </w:r>
+      <w:r>
+        <w:rPr>
+          <w:b/>
+          <w:bCs/>
+        </w:rPr>
+        <w:t>implements</w:t>
+      </w:r>
+      <w:r>
+        <w:t xml:space="preserve"> </w:t>
+      </w:r>
+      <w:proofErr w:type="spellStart"/>
+      <w:r>
+        <w:t>ISellingSystem</w:t>
+      </w:r>
+      <w:proofErr w:type="spellEnd"/>
+      <w:r>
+        <w:t xml:space="preserve"> {</w:t>
+      </w:r>
+    </w:p>
+    <w:p>
+      <w:r>
+        <w:tab/>
+        <w:t>@Override</w:t>
+      </w:r>
+    </w:p>
+    <w:p>
+      <w:r>
+        <w:tab/>
+      </w:r>
+      <w:r>
+        <w:rPr>
+          <w:b/>
+          <w:bCs/>
+        </w:rPr>
+        <w:t>public</w:t>
+      </w:r>
+      <w:r>
+        <w:t xml:space="preserve"> </w:t>
+      </w:r>
+      <w:r>
+        <w:rPr>
+          <w:b/>
+          <w:bCs/>
+        </w:rPr>
+        <w:t>void</w:t>
+      </w:r>
+      <w:r>
+        <w:t xml:space="preserve"> </w:t>
+      </w:r>
+      <w:proofErr w:type="gramStart"/>
+      <w:r>
+        <w:t>sales(</w:t>
+      </w:r>
+      <w:proofErr w:type="gramEnd"/>
+      <w:r>
+        <w:t>) {</w:t>
+      </w:r>
+    </w:p>
+    <w:p>
+      <w:r>
+        <w:tab/>
+      </w:r>
+      <w:r>
+        <w:tab/>
+      </w:r>
+      <w:proofErr w:type="spellStart"/>
+      <w:r>
+        <w:t>System.</w:t>
+      </w:r>
+      <w:r>
+        <w:rPr>
+          <w:b/>
+          <w:bCs/>
+          <w:i/>
+          <w:iCs/>
+        </w:rPr>
+        <w:t>out</w:t>
+      </w:r>
+      <w:r>
+        <w:t>.println</w:t>
+      </w:r>
+      <w:proofErr w:type="spellEnd"/>
+      <w:r>
+        <w:t>("B2BCompanies.sales()");</w:t>
+      </w:r>
+    </w:p>
+    <w:p/>
+    <w:p>
+      <w:r>
+        <w:tab/>
+        <w:t>}</w:t>
+      </w:r>
+    </w:p>
+    <w:p/>
+    <w:p>
+      <w:r>
+        <w:tab/>
+        <w:t>@Override</w:t>
+      </w:r>
+    </w:p>
+    <w:p>
+      <w:r>
+        <w:tab/>
+      </w:r>
+      <w:r>
+        <w:rPr>
+          <w:b/>
+          <w:bCs/>
+        </w:rPr>
+        <w:t>public</w:t>
+      </w:r>
+      <w:r>
+        <w:t xml:space="preserve"> </w:t>
+      </w:r>
+      <w:r>
+        <w:rPr>
+          <w:b/>
+          <w:bCs/>
+        </w:rPr>
+        <w:t>void</w:t>
+      </w:r>
+      <w:r>
+        <w:t xml:space="preserve"> </w:t>
+      </w:r>
+      <w:proofErr w:type="gramStart"/>
+      <w:r>
+        <w:t>marketing(</w:t>
+      </w:r>
+      <w:proofErr w:type="gramEnd"/>
+      <w:r>
+        <w:t>) {</w:t>
+      </w:r>
+    </w:p>
+    <w:p>
+      <w:r>
+        <w:tab/>
+      </w:r>
+      <w:r>
+        <w:tab/>
+      </w:r>
+      <w:proofErr w:type="spellStart"/>
+      <w:r>
+        <w:t>System.</w:t>
+      </w:r>
+      <w:r>
+        <w:rPr>
+          <w:b/>
+          <w:bCs/>
+          <w:i/>
+          <w:iCs/>
+        </w:rPr>
+        <w:t>out</w:t>
+      </w:r>
+      <w:r>
+        <w:t>.println</w:t>
+      </w:r>
+      <w:proofErr w:type="spellEnd"/>
+      <w:r>
+        <w:t>("B2BCompanies.marketing()");</w:t>
+      </w:r>
+    </w:p>
+    <w:p>
+      <w:r>
+        <w:tab/>
+      </w:r>
+      <w:r>
+        <w:tab/>
+      </w:r>
+      <w:proofErr w:type="spellStart"/>
+      <w:r>
+        <w:t>ISellingSystem.</w:t>
+      </w:r>
+      <w:r>
+        <w:rPr>
+          <w:i/>
+          <w:iCs/>
+        </w:rPr>
+        <w:t>strategies</w:t>
+      </w:r>
+      <w:proofErr w:type="spellEnd"/>
+      <w:r>
+        <w:t>();</w:t>
+      </w:r>
+    </w:p>
+    <w:p>
+      <w:r>
+        <w:tab/>
+        <w:t>}</w:t>
+      </w:r>
+    </w:p>
+    <w:p/>
+    <w:p>
+      <w:r>
+        <w:t>}</w:t>
+      </w:r>
+    </w:p>
+    <w:p/>
+    <w:p>
+      <w:r>
+        <w:rPr>
+          <w:b/>
+          <w:bCs/>
+        </w:rPr>
+        <w:t>class</w:t>
+      </w:r>
+      <w:r>
+        <w:t xml:space="preserve"> B2CCompanies </w:t>
+      </w:r>
+      <w:r>
+        <w:rPr>
+          <w:b/>
+          <w:bCs/>
+        </w:rPr>
+        <w:t>implements</w:t>
+      </w:r>
+      <w:r>
+        <w:t xml:space="preserve"> </w:t>
+      </w:r>
+      <w:proofErr w:type="spellStart"/>
+      <w:r>
+        <w:t>ISellingSystem</w:t>
+      </w:r>
+      <w:proofErr w:type="spellEnd"/>
+      <w:r>
+        <w:t xml:space="preserve"> {</w:t>
+      </w:r>
+    </w:p>
+    <w:p>
+      <w:r>
+        <w:tab/>
+        <w:t>@Override</w:t>
+      </w:r>
+    </w:p>
+    <w:p>
+      <w:r>
+        <w:tab/>
+      </w:r>
+      <w:r>
+        <w:rPr>
+          <w:b/>
+          <w:bCs/>
+        </w:rPr>
+        <w:t>public</w:t>
+      </w:r>
+      <w:r>
+        <w:t xml:space="preserve"> </w:t>
+      </w:r>
+      <w:r>
+        <w:rPr>
+          <w:b/>
+          <w:bCs/>
+        </w:rPr>
+        <w:t>void</w:t>
+      </w:r>
+      <w:r>
+        <w:t xml:space="preserve"> </w:t>
+      </w:r>
+      <w:proofErr w:type="gramStart"/>
+      <w:r>
+        <w:t>sales(</w:t>
+      </w:r>
+      <w:proofErr w:type="gramEnd"/>
+      <w:r>
+        <w:t>) {</w:t>
+      </w:r>
+    </w:p>
+    <w:p>
+      <w:r>
+        <w:lastRenderedPageBreak/>
+        <w:tab/>
+      </w:r>
+      <w:r>
+        <w:tab/>
+      </w:r>
+      <w:proofErr w:type="spellStart"/>
+      <w:r>
+        <w:t>System.</w:t>
+      </w:r>
+      <w:r>
+        <w:rPr>
+          <w:b/>
+          <w:bCs/>
+          <w:i/>
+          <w:iCs/>
+        </w:rPr>
+        <w:t>out</w:t>
+      </w:r>
+      <w:r>
+        <w:t>.println</w:t>
+      </w:r>
+      <w:proofErr w:type="spellEnd"/>
+      <w:r>
+        <w:t>("B2CCompanies.sales()");</w:t>
+      </w:r>
+    </w:p>
+    <w:p>
+      <w:r>
+        <w:tab/>
+        <w:t>}</w:t>
+      </w:r>
+    </w:p>
+    <w:p/>
+    <w:p>
+      <w:r>
+        <w:tab/>
+        <w:t>@Override</w:t>
+      </w:r>
+    </w:p>
+    <w:p>
+      <w:r>
+        <w:tab/>
+      </w:r>
+      <w:r>
+        <w:rPr>
+          <w:b/>
+          <w:bCs/>
+        </w:rPr>
+        <w:t>public</w:t>
+      </w:r>
+      <w:r>
+        <w:t xml:space="preserve"> </w:t>
+      </w:r>
+      <w:r>
+        <w:rPr>
+          <w:b/>
+          <w:bCs/>
+        </w:rPr>
+        <w:t>void</w:t>
+      </w:r>
+      <w:r>
+        <w:t xml:space="preserve"> </w:t>
+      </w:r>
+      <w:proofErr w:type="gramStart"/>
+      <w:r>
+        <w:t>marketing(</w:t>
+      </w:r>
+      <w:proofErr w:type="gramEnd"/>
+      <w:r>
+        <w:t>) {</w:t>
+      </w:r>
+    </w:p>
+    <w:p>
+      <w:r>
+        <w:tab/>
+      </w:r>
+      <w:r>
+        <w:tab/>
+      </w:r>
+      <w:proofErr w:type="spellStart"/>
+      <w:r>
+        <w:t>System.</w:t>
+      </w:r>
+      <w:r>
+        <w:rPr>
+          <w:b/>
+          <w:bCs/>
+          <w:i/>
+          <w:iCs/>
+        </w:rPr>
+        <w:t>out</w:t>
+      </w:r>
+      <w:r>
+        <w:t>.println</w:t>
+      </w:r>
+      <w:proofErr w:type="spellEnd"/>
+      <w:r>
+        <w:t>("B2CCompanies.marketing()");</w:t>
+      </w:r>
+    </w:p>
+    <w:p>
+      <w:r>
+        <w:tab/>
+      </w:r>
+      <w:r>
+        <w:tab/>
+      </w:r>
+      <w:proofErr w:type="spellStart"/>
+      <w:r>
+        <w:t>ISellingSystem.</w:t>
+      </w:r>
+      <w:r>
+        <w:rPr>
+          <w:i/>
+          <w:iCs/>
+        </w:rPr>
+        <w:t>networkingSkills</w:t>
+      </w:r>
+      <w:proofErr w:type="spellEnd"/>
+      <w:r>
+        <w:t>();</w:t>
+      </w:r>
+    </w:p>
+    <w:p>
+      <w:r>
+        <w:tab/>
+        <w:t>}</w:t>
+      </w:r>
+    </w:p>
+    <w:p>
+      <w:r>
+        <w:t>}</w:t>
+      </w:r>
+    </w:p>
+    <w:p/>
+    <w:p>
+      <w:r>
+        <w:rPr>
+          <w:b/>
+          <w:bCs/>
+        </w:rPr>
+        <w:t>public</w:t>
+      </w:r>
+      <w:r>
+        <w:t xml:space="preserve"> </w:t>
+      </w:r>
+      <w:r>
+        <w:rPr>
+          <w:b/>
+          <w:bCs/>
+        </w:rPr>
+        <w:t>class</w:t>
+      </w:r>
+      <w:r>
+        <w:t xml:space="preserve"> </w:t>
+      </w:r>
+      <w:proofErr w:type="spellStart"/>
+      <w:r>
+        <w:t>TryingInterfaceIssues</w:t>
+      </w:r>
+      <w:proofErr w:type="spellEnd"/>
+      <w:r>
+        <w:t xml:space="preserve"> {</w:t>
+      </w:r>
+    </w:p>
+    <w:p/>
+    <w:p>
+      <w:r>
+        <w:tab/>
+      </w:r>
+      <w:r>
+        <w:rPr>
+          <w:b/>
+          <w:bCs/>
+        </w:rPr>
+        <w:t>public</w:t>
+      </w:r>
+      <w:r>
+        <w:t xml:space="preserve"> </w:t>
+      </w:r>
+      <w:r>
+        <w:rPr>
+          <w:b/>
+          <w:bCs/>
+        </w:rPr>
+        <w:t>static</w:t>
+      </w:r>
+      <w:r>
+        <w:t xml:space="preserve"> </w:t>
+      </w:r>
+      <w:r>
+        <w:rPr>
+          <w:b/>
+          <w:bCs/>
+        </w:rPr>
+        <w:t>void</w:t>
+      </w:r>
+      <w:r>
+        <w:t xml:space="preserve"> </w:t>
+      </w:r>
+      <w:proofErr w:type="gramStart"/>
+      <w:r>
+        <w:t>main(String[</w:t>
+      </w:r>
+      <w:proofErr w:type="gramEnd"/>
+      <w:r>
+        <w:t xml:space="preserve">] </w:t>
+      </w:r>
+      <w:proofErr w:type="spellStart"/>
+      <w:r>
+        <w:t>args</w:t>
+      </w:r>
+      <w:proofErr w:type="spellEnd"/>
+      <w:r>
+        <w:t>) {</w:t>
+      </w:r>
+    </w:p>
+    <w:p>
+      <w:r>
+        <w:tab/>
+      </w:r>
+      <w:r>
+        <w:tab/>
+        <w:t xml:space="preserve">B2BCompanies </w:t>
+      </w:r>
+      <w:proofErr w:type="spellStart"/>
+      <w:r>
+        <w:t>bB</w:t>
+      </w:r>
+      <w:proofErr w:type="spellEnd"/>
+      <w:r>
+        <w:t xml:space="preserve"> = </w:t>
+      </w:r>
+      <w:r>
+        <w:rPr>
+          <w:b/>
+          <w:bCs/>
+        </w:rPr>
+        <w:t>new</w:t>
+      </w:r>
+      <w:r>
+        <w:t xml:space="preserve"> B2</w:t>
+      </w:r>
+      <w:proofErr w:type="gramStart"/>
+      <w:r>
+        <w:t>BCompanies(</w:t>
+      </w:r>
+      <w:proofErr w:type="gramEnd"/>
+      <w:r>
+        <w:t>);</w:t>
+      </w:r>
+    </w:p>
+    <w:p>
+      <w:r>
+        <w:tab/>
+      </w:r>
+      <w:r>
+        <w:tab/>
+      </w:r>
+      <w:proofErr w:type="spellStart"/>
+      <w:proofErr w:type="gramStart"/>
+      <w:r>
+        <w:t>bB.sales</w:t>
+      </w:r>
+      <w:proofErr w:type="spellEnd"/>
+      <w:proofErr w:type="gramEnd"/>
+      <w:r>
+        <w:t>();</w:t>
+      </w:r>
+    </w:p>
+    <w:p>
+      <w:r>
+        <w:tab/>
+      </w:r>
+      <w:r>
+        <w:tab/>
+      </w:r>
+      <w:proofErr w:type="spellStart"/>
+      <w:proofErr w:type="gramStart"/>
+      <w:r>
+        <w:t>bB.marketing</w:t>
+      </w:r>
+      <w:proofErr w:type="spellEnd"/>
+      <w:proofErr w:type="gramEnd"/>
+      <w:r>
+        <w:t>();</w:t>
+      </w:r>
+    </w:p>
+    <w:p>
+      <w:r>
+        <w:tab/>
+      </w:r>
+      <w:r>
+        <w:tab/>
+        <w:t xml:space="preserve">// </w:t>
+      </w:r>
+      <w:proofErr w:type="spellStart"/>
+      <w:proofErr w:type="gramStart"/>
+      <w:r>
+        <w:t>bB.networkingSkills</w:t>
+      </w:r>
+      <w:proofErr w:type="spellEnd"/>
+      <w:proofErr w:type="gramEnd"/>
+      <w:r>
+        <w:t>();</w:t>
+      </w:r>
+    </w:p>
+    <w:p>
+      <w:r>
+        <w:tab/>
+      </w:r>
+      <w:r>
+        <w:tab/>
+      </w:r>
+      <w:proofErr w:type="spellStart"/>
+      <w:r>
+        <w:t>System.</w:t>
+      </w:r>
+      <w:r>
+        <w:rPr>
+          <w:b/>
+          <w:bCs/>
+          <w:i/>
+          <w:iCs/>
+        </w:rPr>
+        <w:t>out</w:t>
+      </w:r>
+      <w:r>
+        <w:t>.println</w:t>
+      </w:r>
+      <w:proofErr w:type="spellEnd"/>
+      <w:r>
+        <w:t>("-----------&gt;");</w:t>
+      </w:r>
+    </w:p>
+    <w:p/>
+    <w:p>
+      <w:r>
+        <w:tab/>
+      </w:r>
+      <w:r>
+        <w:tab/>
+        <w:t xml:space="preserve">B2CCompanies </w:t>
+      </w:r>
+      <w:proofErr w:type="spellStart"/>
+      <w:r>
+        <w:t>bC</w:t>
+      </w:r>
+      <w:proofErr w:type="spellEnd"/>
+      <w:r>
+        <w:t xml:space="preserve"> = </w:t>
+      </w:r>
+      <w:r>
+        <w:rPr>
+          <w:b/>
+          <w:bCs/>
+        </w:rPr>
+        <w:t>new</w:t>
+      </w:r>
+      <w:r>
+        <w:t xml:space="preserve"> B2</w:t>
+      </w:r>
+      <w:proofErr w:type="gramStart"/>
+      <w:r>
+        <w:t>CCompanies(</w:t>
+      </w:r>
+      <w:proofErr w:type="gramEnd"/>
+      <w:r>
+        <w:t>);</w:t>
+      </w:r>
+    </w:p>
+    <w:p>
+      <w:r>
+        <w:tab/>
+      </w:r>
+      <w:r>
+        <w:tab/>
+      </w:r>
+      <w:proofErr w:type="spellStart"/>
+      <w:proofErr w:type="gramStart"/>
+      <w:r>
+        <w:t>bC.sales</w:t>
+      </w:r>
+      <w:proofErr w:type="spellEnd"/>
+      <w:proofErr w:type="gramEnd"/>
+      <w:r>
+        <w:t>();</w:t>
+      </w:r>
+    </w:p>
+    <w:p>
+      <w:r>
+        <w:tab/>
+      </w:r>
+      <w:r>
+        <w:tab/>
+      </w:r>
+      <w:proofErr w:type="spellStart"/>
+      <w:proofErr w:type="gramStart"/>
+      <w:r>
+        <w:t>bC.marketing</w:t>
+      </w:r>
+      <w:proofErr w:type="spellEnd"/>
+      <w:proofErr w:type="gramEnd"/>
+      <w:r>
+        <w:t>();</w:t>
+      </w:r>
+    </w:p>
+    <w:p>
+      <w:r>
+        <w:tab/>
+        <w:t>}</w:t>
+      </w:r>
+    </w:p>
+    <w:p>
+      <w:r>
+        <w:t>}</w:t>
+      </w:r>
+    </w:p>
+    <w:p/>
+    <w:p>
+      <w:r>
+        <w:t>//B2BCompanies.sales()</w:t>
+      </w:r>
+    </w:p>
+    <w:p>
+      <w:r>
+        <w:lastRenderedPageBreak/>
+        <w:t>//B2BCompanies.marketing()</w:t>
+      </w:r>
+    </w:p>
+    <w:p>
+      <w:r>
+        <w:t>//</w:t>
+      </w:r>
+      <w:proofErr w:type="spellStart"/>
+      <w:r>
+        <w:t>SellingSystem.strategies</w:t>
+      </w:r>
+      <w:proofErr w:type="spellEnd"/>
+      <w:r>
+        <w:t>()</w:t>
+      </w:r>
+    </w:p>
+    <w:p>
+      <w:r>
+        <w:t xml:space="preserve">//This is </w:t>
+      </w:r>
+      <w:proofErr w:type="spellStart"/>
+      <w:r>
+        <w:rPr>
+          <w:u w:val="single"/>
+        </w:rPr>
+        <w:t>alsmost</w:t>
+      </w:r>
+      <w:proofErr w:type="spellEnd"/>
+      <w:r>
+        <w:t xml:space="preserve"> similar for all, so need to change and write again and again</w:t>
+      </w:r>
+    </w:p>
+    <w:p>
+      <w:r>
+        <w:t>//-----------&gt;</w:t>
+      </w:r>
+    </w:p>
+    <w:p>
+      <w:r>
+        <w:t>//B2CCompanies.sales()</w:t>
+      </w:r>
+    </w:p>
+    <w:p>
+      <w:r>
+        <w:t>//B2CCompanies.marketing()</w:t>
+      </w:r>
+    </w:p>
+    <w:p>
+      <w:r>
+        <w:t>//</w:t>
+      </w:r>
+      <w:proofErr w:type="spellStart"/>
+      <w:r>
+        <w:t>SellingSystem.networkingSkills</w:t>
+      </w:r>
+      <w:proofErr w:type="spellEnd"/>
+      <w:r>
+        <w:t>()</w:t>
+      </w:r>
+    </w:p>
+    <w:p>
+      <w:r>
+        <w:t xml:space="preserve">//This is </w:t>
+      </w:r>
+      <w:proofErr w:type="gramStart"/>
+      <w:r>
+        <w:t>a  common</w:t>
+      </w:r>
+      <w:proofErr w:type="gramEnd"/>
+      <w:r>
+        <w:t xml:space="preserve"> message required by everyone, so can be print in one time and then provide </w:t>
+      </w:r>
+      <w:r>
+        <w:rPr>
+          <w:u w:val="single"/>
+        </w:rPr>
+        <w:t>reusability</w:t>
+      </w:r>
+    </w:p>
+    <w:p/>
+    <w:p>
+      <w:r>
+        <w:t xml:space="preserve">--------------- </w:t>
+      </w:r>
+    </w:p>
+    <w:p/>
+    <w:p>
+      <w:pPr>
+        <w:rPr>
+          <w:b/>
+          <w:bCs/>
+        </w:rPr>
+      </w:pPr>
+      <w:proofErr w:type="spellStart"/>
+      <w:r>
+        <w:rPr>
+          <w:b/>
+          <w:bCs/>
+        </w:rPr>
+        <w:t>FixingInterfaceIssues</w:t>
+      </w:r>
+      <w:proofErr w:type="spellEnd"/>
+    </w:p>
+    <w:p>
+      <w:r>
+        <w:rPr>
+          <w:b/>
+          <w:bCs/>
+        </w:rPr>
+        <w:t>package</w:t>
+      </w:r>
+      <w:r>
+        <w:t xml:space="preserve"> </w:t>
+      </w:r>
+      <w:proofErr w:type="gramStart"/>
+      <w:r>
+        <w:t>com.Revision.D</w:t>
+      </w:r>
+      <w:proofErr w:type="gramEnd"/>
+      <w:r>
+        <w:t>35;</w:t>
+      </w:r>
+    </w:p>
+    <w:p/>
+    <w:p>
+      <w:r>
+        <w:rPr>
+          <w:b/>
+          <w:bCs/>
+        </w:rPr>
+        <w:t>interface</w:t>
+      </w:r>
+      <w:r>
+        <w:t xml:space="preserve"> ISellingSystem2 {</w:t>
+      </w:r>
+    </w:p>
+    <w:p>
+      <w:r>
+        <w:tab/>
+      </w:r>
+      <w:r>
+        <w:rPr>
+          <w:b/>
+          <w:bCs/>
+        </w:rPr>
+        <w:t>void</w:t>
+      </w:r>
+      <w:r>
+        <w:t xml:space="preserve"> sales2();</w:t>
+      </w:r>
+    </w:p>
+    <w:p/>
+    <w:p>
+      <w:r>
+        <w:tab/>
+      </w:r>
+      <w:r>
+        <w:rPr>
+          <w:b/>
+          <w:bCs/>
+        </w:rPr>
+        <w:t>void</w:t>
+      </w:r>
+      <w:r>
+        <w:t xml:space="preserve"> marketing2();</w:t>
+      </w:r>
+    </w:p>
+    <w:p/>
+    <w:p>
+      <w:r>
+        <w:tab/>
+      </w:r>
+      <w:r>
+        <w:rPr>
+          <w:b/>
+          <w:bCs/>
+        </w:rPr>
+        <w:t>public</w:t>
+      </w:r>
+      <w:r>
+        <w:t xml:space="preserve"> </w:t>
+      </w:r>
+      <w:r>
+        <w:rPr>
+          <w:b/>
+          <w:bCs/>
+        </w:rPr>
+        <w:t>static</w:t>
+      </w:r>
+      <w:r>
+        <w:t xml:space="preserve"> </w:t>
+      </w:r>
+      <w:r>
+        <w:rPr>
+          <w:b/>
+          <w:bCs/>
+        </w:rPr>
+        <w:t>void</w:t>
+      </w:r>
+      <w:r>
+        <w:t xml:space="preserve"> strategies2() {</w:t>
+      </w:r>
+    </w:p>
+    <w:p>
+      <w:r>
+        <w:tab/>
+      </w:r>
+      <w:r>
+        <w:tab/>
+      </w:r>
+      <w:proofErr w:type="spellStart"/>
+      <w:r>
+        <w:t>System.</w:t>
+      </w:r>
+      <w:r>
+        <w:rPr>
+          <w:b/>
+          <w:bCs/>
+          <w:i/>
+          <w:iCs/>
+        </w:rPr>
+        <w:t>out</w:t>
+      </w:r>
+      <w:r>
+        <w:t>.println</w:t>
+      </w:r>
+      <w:proofErr w:type="spellEnd"/>
+      <w:r>
+        <w:t>("</w:t>
+      </w:r>
+      <w:proofErr w:type="spellStart"/>
+      <w:r>
+        <w:t>SellingSystem.strategies</w:t>
+      </w:r>
+      <w:proofErr w:type="spellEnd"/>
+      <w:r>
+        <w:t>()");</w:t>
+      </w:r>
+    </w:p>
+    <w:p>
+      <w:r>
+        <w:tab/>
+      </w:r>
+      <w:r>
+        <w:tab/>
+      </w:r>
+      <w:proofErr w:type="spellStart"/>
+      <w:r>
+        <w:t>System.</w:t>
+      </w:r>
+      <w:r>
+        <w:rPr>
+          <w:b/>
+          <w:bCs/>
+          <w:i/>
+          <w:iCs/>
+        </w:rPr>
+        <w:t>out</w:t>
+      </w:r>
+      <w:r>
+        <w:t>.println</w:t>
+      </w:r>
+      <w:proofErr w:type="spellEnd"/>
+      <w:r>
+        <w:t xml:space="preserve">("This is </w:t>
+      </w:r>
+      <w:proofErr w:type="spellStart"/>
+      <w:r>
+        <w:t>alsmost</w:t>
+      </w:r>
+      <w:proofErr w:type="spellEnd"/>
+      <w:r>
+        <w:t xml:space="preserve"> similar for all, so need to change and write again and again");</w:t>
+      </w:r>
+    </w:p>
+    <w:p>
+      <w:r>
+        <w:tab/>
+        <w:t>}</w:t>
+      </w:r>
+    </w:p>
+    <w:p/>
+    <w:p>
+      <w:r>
+        <w:tab/>
+      </w:r>
+      <w:r>
+        <w:rPr>
+          <w:b/>
+          <w:bCs/>
+        </w:rPr>
+        <w:t>public</w:t>
+      </w:r>
+      <w:r>
+        <w:t xml:space="preserve"> </w:t>
+      </w:r>
+      <w:r>
+        <w:rPr>
+          <w:b/>
+          <w:bCs/>
+        </w:rPr>
+        <w:t>static</w:t>
+      </w:r>
+      <w:r>
+        <w:t xml:space="preserve"> </w:t>
+      </w:r>
+      <w:r>
+        <w:rPr>
+          <w:b/>
+          <w:bCs/>
+        </w:rPr>
+        <w:t>void</w:t>
+      </w:r>
+      <w:r>
+        <w:t xml:space="preserve"> networkingSkills2() {</w:t>
+      </w:r>
+    </w:p>
+    <w:p>
+      <w:r>
+        <w:lastRenderedPageBreak/>
+        <w:tab/>
+      </w:r>
+      <w:r>
+        <w:tab/>
+      </w:r>
+      <w:proofErr w:type="spellStart"/>
+      <w:r>
+        <w:t>System.</w:t>
+      </w:r>
+      <w:r>
+        <w:rPr>
+          <w:b/>
+          <w:bCs/>
+          <w:i/>
+          <w:iCs/>
+        </w:rPr>
+        <w:t>out</w:t>
+      </w:r>
+      <w:r>
+        <w:t>.println</w:t>
+      </w:r>
+      <w:proofErr w:type="spellEnd"/>
+      <w:r>
+        <w:t>("</w:t>
+      </w:r>
+      <w:proofErr w:type="spellStart"/>
+      <w:r>
+        <w:t>SellingSystem.networkingSkills</w:t>
+      </w:r>
+      <w:proofErr w:type="spellEnd"/>
+      <w:r>
+        <w:t>()");</w:t>
+      </w:r>
+    </w:p>
+    <w:p>
+      <w:r>
+        <w:tab/>
+      </w:r>
+      <w:r>
+        <w:tab/>
+      </w:r>
+      <w:proofErr w:type="spellStart"/>
+      <w:r>
+        <w:t>System.</w:t>
+      </w:r>
+      <w:r>
+        <w:rPr>
+          <w:b/>
+          <w:bCs/>
+          <w:i/>
+          <w:iCs/>
+        </w:rPr>
+        <w:t>out</w:t>
+      </w:r>
+      <w:r>
+        <w:t>.println</w:t>
+      </w:r>
+      <w:proofErr w:type="spellEnd"/>
+      <w:r>
+        <w:t xml:space="preserve">("This is </w:t>
+      </w:r>
+      <w:proofErr w:type="gramStart"/>
+      <w:r>
+        <w:t>a  common</w:t>
+      </w:r>
+      <w:proofErr w:type="gramEnd"/>
+      <w:r>
+        <w:t xml:space="preserve"> message required by everyone, so can be print in one time and then provide reusability");</w:t>
+      </w:r>
+    </w:p>
+    <w:p>
+      <w:r>
+        <w:tab/>
+        <w:t>}</w:t>
+      </w:r>
+    </w:p>
+    <w:p/>
+    <w:p>
+      <w:r>
+        <w:tab/>
+      </w:r>
+      <w:r>
+        <w:rPr>
+          <w:b/>
+          <w:bCs/>
+        </w:rPr>
+        <w:t>private</w:t>
+      </w:r>
+      <w:r>
+        <w:t xml:space="preserve"> </w:t>
+      </w:r>
+      <w:r>
+        <w:rPr>
+          <w:b/>
+          <w:bCs/>
+        </w:rPr>
+        <w:t>static</w:t>
+      </w:r>
+      <w:r>
+        <w:t xml:space="preserve"> </w:t>
+      </w:r>
+      <w:r>
+        <w:rPr>
+          <w:b/>
+          <w:bCs/>
+        </w:rPr>
+        <w:t>void</w:t>
+      </w:r>
+      <w:r>
+        <w:t xml:space="preserve"> </w:t>
+      </w:r>
+      <w:proofErr w:type="spellStart"/>
+      <w:proofErr w:type="gramStart"/>
+      <w:r>
+        <w:rPr>
+          <w:u w:val="single"/>
+        </w:rPr>
+        <w:t>digitalAssets</w:t>
+      </w:r>
+      <w:proofErr w:type="spellEnd"/>
+      <w:r>
+        <w:rPr>
+          <w:u w:val="single"/>
+        </w:rPr>
+        <w:t>(</w:t>
+      </w:r>
+      <w:proofErr w:type="gramEnd"/>
+      <w:r>
+        <w:rPr>
+          <w:u w:val="single"/>
+        </w:rPr>
+        <w:t>)</w:t>
+      </w:r>
+      <w:r>
+        <w:t xml:space="preserve"> // by changing version to java 9, we can fix it.</w:t>
+      </w:r>
+    </w:p>
+    <w:p>
+      <w:r>
+        <w:tab/>
+        <w:t>{</w:t>
+      </w:r>
+    </w:p>
+    <w:p>
+      <w:r>
+        <w:tab/>
+      </w:r>
+      <w:r>
+        <w:tab/>
+      </w:r>
+      <w:proofErr w:type="spellStart"/>
+      <w:r>
+        <w:t>System.</w:t>
+      </w:r>
+      <w:r>
+        <w:rPr>
+          <w:b/>
+          <w:bCs/>
+          <w:i/>
+          <w:iCs/>
+        </w:rPr>
+        <w:t>out</w:t>
+      </w:r>
+      <w:r>
+        <w:t>.println</w:t>
+      </w:r>
+      <w:proofErr w:type="spellEnd"/>
+      <w:r>
+        <w:t>("ISellingSystem2.digitalAssets()");</w:t>
+      </w:r>
+    </w:p>
+    <w:p>
+      <w:r>
+        <w:tab/>
+      </w:r>
+      <w:r>
+        <w:tab/>
+      </w:r>
+      <w:proofErr w:type="spellStart"/>
+      <w:r>
+        <w:t>System.</w:t>
+      </w:r>
+      <w:r>
+        <w:rPr>
+          <w:b/>
+          <w:bCs/>
+          <w:i/>
+          <w:iCs/>
+        </w:rPr>
+        <w:t>out</w:t>
+      </w:r>
+      <w:r>
+        <w:t>.println</w:t>
+      </w:r>
+      <w:proofErr w:type="spellEnd"/>
+      <w:r>
+        <w:t xml:space="preserve">("These are some personal </w:t>
+      </w:r>
+      <w:proofErr w:type="spellStart"/>
+      <w:r>
+        <w:t>digitsl</w:t>
+      </w:r>
+      <w:proofErr w:type="spellEnd"/>
+      <w:r>
+        <w:t xml:space="preserve"> assets which will be using again and again");</w:t>
+      </w:r>
+    </w:p>
+    <w:p>
+      <w:r>
+        <w:tab/>
+        <w:t>}</w:t>
+      </w:r>
+    </w:p>
+    <w:p/>
+    <w:p>
+      <w:r>
+        <w:tab/>
+      </w:r>
+      <w:r>
+        <w:rPr>
+          <w:b/>
+          <w:bCs/>
+        </w:rPr>
+        <w:t>private</w:t>
+      </w:r>
+      <w:r>
+        <w:t xml:space="preserve"> </w:t>
+      </w:r>
+      <w:r>
+        <w:rPr>
+          <w:b/>
+          <w:bCs/>
+        </w:rPr>
+        <w:t>static</w:t>
+      </w:r>
+      <w:r>
+        <w:t xml:space="preserve"> </w:t>
+      </w:r>
+      <w:r>
+        <w:rPr>
+          <w:b/>
+          <w:bCs/>
+        </w:rPr>
+        <w:t>void</w:t>
+      </w:r>
+      <w:r>
+        <w:t xml:space="preserve"> </w:t>
+      </w:r>
+      <w:proofErr w:type="spellStart"/>
+      <w:proofErr w:type="gramStart"/>
+      <w:r>
+        <w:rPr>
+          <w:u w:val="single"/>
+        </w:rPr>
+        <w:t>customerCaring</w:t>
+      </w:r>
+      <w:proofErr w:type="spellEnd"/>
+      <w:r>
+        <w:rPr>
+          <w:u w:val="single"/>
+        </w:rPr>
+        <w:t>(</w:t>
+      </w:r>
+      <w:proofErr w:type="gramEnd"/>
+      <w:r>
+        <w:rPr>
+          <w:u w:val="single"/>
+        </w:rPr>
+        <w:t>)</w:t>
+      </w:r>
+      <w:r>
+        <w:t>; // by changing version to java 9, we can fix it.</w:t>
+      </w:r>
+    </w:p>
+    <w:p>
+      <w:r>
+        <w:tab/>
+      </w:r>
+      <w:r>
+        <w:rPr>
+          <w:u w:val="single"/>
+        </w:rPr>
+        <w:t>{</w:t>
+      </w:r>
+    </w:p>
+    <w:p>
+      <w:r>
+        <w:rPr>
+          <w:u w:val="single"/>
+        </w:rPr>
+        <w:tab/>
+      </w:r>
+      <w:r>
+        <w:rPr>
+          <w:u w:val="single"/>
+        </w:rPr>
+        <w:tab/>
+      </w:r>
+      <w:proofErr w:type="spellStart"/>
+      <w:r>
+        <w:rPr>
+          <w:u w:val="single"/>
+        </w:rPr>
+        <w:t>System.</w:t>
+      </w:r>
+      <w:r>
+        <w:rPr>
+          <w:b/>
+          <w:bCs/>
+          <w:i/>
+          <w:iCs/>
+          <w:u w:val="single"/>
+        </w:rPr>
+        <w:t>out</w:t>
+      </w:r>
+      <w:r>
+        <w:rPr>
+          <w:u w:val="single"/>
+        </w:rPr>
+        <w:t>.println</w:t>
+      </w:r>
+      <w:proofErr w:type="spellEnd"/>
+      <w:r>
+        <w:rPr>
+          <w:u w:val="single"/>
+        </w:rPr>
+        <w:t>("ISellingSystem2.enclosing_</w:t>
+      </w:r>
+      <w:proofErr w:type="gramStart"/>
+      <w:r>
+        <w:rPr>
+          <w:u w:val="single"/>
+        </w:rPr>
+        <w:t>method(</w:t>
+      </w:r>
+      <w:proofErr w:type="gramEnd"/>
+      <w:r>
+        <w:rPr>
+          <w:u w:val="single"/>
+        </w:rPr>
+        <w:t>)");</w:t>
+      </w:r>
+    </w:p>
+    <w:p>
+      <w:r>
+        <w:rPr>
+          <w:u w:val="single"/>
+        </w:rPr>
+        <w:tab/>
+      </w:r>
+      <w:r>
+        <w:rPr>
+          <w:u w:val="single"/>
+        </w:rPr>
+        <w:tab/>
+      </w:r>
+      <w:proofErr w:type="spellStart"/>
+      <w:r>
+        <w:rPr>
+          <w:u w:val="single"/>
+        </w:rPr>
+        <w:t>System.</w:t>
+      </w:r>
+      <w:r>
+        <w:rPr>
+          <w:b/>
+          <w:bCs/>
+          <w:i/>
+          <w:iCs/>
+          <w:u w:val="single"/>
+        </w:rPr>
+        <w:t>out</w:t>
+      </w:r>
+      <w:r>
+        <w:rPr>
+          <w:u w:val="single"/>
+        </w:rPr>
+        <w:t>.println</w:t>
+      </w:r>
+      <w:proofErr w:type="spellEnd"/>
+      <w:r>
+        <w:rPr>
+          <w:u w:val="single"/>
+        </w:rPr>
+        <w:t>("This is also same and similar");</w:t>
+      </w:r>
+    </w:p>
+    <w:p>
+      <w:r>
+        <w:rPr>
+          <w:u w:val="single"/>
+        </w:rPr>
+        <w:tab/>
+        <w:t>}</w:t>
+      </w:r>
+    </w:p>
+    <w:p/>
+    <w:p>
+      <w:r>
+        <w:t>}</w:t>
+      </w:r>
+    </w:p>
+    <w:p/>
+    <w:p>
+      <w:r>
+        <w:rPr>
+          <w:b/>
+          <w:bCs/>
+        </w:rPr>
+        <w:t>class</w:t>
+      </w:r>
+      <w:r>
+        <w:t xml:space="preserve"> B2BCompaniesAgain </w:t>
+      </w:r>
+      <w:r>
+        <w:rPr>
+          <w:b/>
+          <w:bCs/>
+        </w:rPr>
+        <w:t>implements</w:t>
+      </w:r>
+      <w:r>
+        <w:t xml:space="preserve"> ISellingSystem2 {</w:t>
+      </w:r>
+    </w:p>
+    <w:p>
+      <w:r>
+        <w:tab/>
+        <w:t>@Override</w:t>
+      </w:r>
+    </w:p>
+    <w:p>
+      <w:r>
+        <w:tab/>
+      </w:r>
+      <w:r>
+        <w:rPr>
+          <w:b/>
+          <w:bCs/>
+        </w:rPr>
+        <w:t>public</w:t>
+      </w:r>
+      <w:r>
+        <w:t xml:space="preserve"> </w:t>
+      </w:r>
+      <w:r>
+        <w:rPr>
+          <w:b/>
+          <w:bCs/>
+        </w:rPr>
+        <w:t>void</w:t>
+      </w:r>
+      <w:r>
+        <w:t xml:space="preserve"> sales2() {</w:t>
+      </w:r>
+    </w:p>
+    <w:p>
+      <w:r>
+        <w:tab/>
+      </w:r>
+      <w:r>
+        <w:tab/>
+      </w:r>
+      <w:proofErr w:type="spellStart"/>
+      <w:r>
+        <w:t>System.</w:t>
+      </w:r>
+      <w:r>
+        <w:rPr>
+          <w:b/>
+          <w:bCs/>
+          <w:i/>
+          <w:iCs/>
+        </w:rPr>
+        <w:t>out</w:t>
+      </w:r>
+      <w:r>
+        <w:t>.println</w:t>
+      </w:r>
+      <w:proofErr w:type="spellEnd"/>
+      <w:r>
+        <w:t>("B2BCompanies.sales2()");</w:t>
+      </w:r>
+    </w:p>
+    <w:p/>
+    <w:p>
+      <w:r>
+        <w:tab/>
+        <w:t>}</w:t>
+      </w:r>
+    </w:p>
+    <w:p/>
+    <w:p>
+      <w:r>
+        <w:lastRenderedPageBreak/>
+        <w:tab/>
+        <w:t>@Override</w:t>
+      </w:r>
+    </w:p>
+    <w:p>
+      <w:r>
+        <w:tab/>
+      </w:r>
+      <w:r>
+        <w:rPr>
+          <w:b/>
+          <w:bCs/>
+        </w:rPr>
+        <w:t>public</w:t>
+      </w:r>
+      <w:r>
+        <w:t xml:space="preserve"> </w:t>
+      </w:r>
+      <w:r>
+        <w:rPr>
+          <w:b/>
+          <w:bCs/>
+        </w:rPr>
+        <w:t>void</w:t>
+      </w:r>
+      <w:r>
+        <w:t xml:space="preserve"> marketing2() {</w:t>
+      </w:r>
+    </w:p>
+    <w:p>
+      <w:r>
+        <w:tab/>
+      </w:r>
+      <w:r>
+        <w:tab/>
+      </w:r>
+      <w:proofErr w:type="spellStart"/>
+      <w:r>
+        <w:t>System.</w:t>
+      </w:r>
+      <w:r>
+        <w:rPr>
+          <w:b/>
+          <w:bCs/>
+          <w:i/>
+          <w:iCs/>
+        </w:rPr>
+        <w:t>out</w:t>
+      </w:r>
+      <w:r>
+        <w:t>.println</w:t>
+      </w:r>
+      <w:proofErr w:type="spellEnd"/>
+      <w:r>
+        <w:t>("B2BCompanies.marketing2()");</w:t>
+      </w:r>
+    </w:p>
+    <w:p>
+      <w:r>
+        <w:tab/>
+      </w:r>
+      <w:r>
+        <w:tab/>
+        <w:t>ISellingSystem2.</w:t>
+      </w:r>
+      <w:r>
+        <w:rPr>
+          <w:i/>
+          <w:iCs/>
+        </w:rPr>
+        <w:t>strategies2</w:t>
+      </w:r>
+      <w:r>
+        <w:t>();</w:t>
+      </w:r>
+    </w:p>
+    <w:p>
+      <w:r>
+        <w:tab/>
+        <w:t>}</w:t>
+      </w:r>
+    </w:p>
+    <w:p/>
+    <w:p>
+      <w:r>
+        <w:t>}</w:t>
+      </w:r>
+    </w:p>
+    <w:p/>
+    <w:p>
+      <w:r>
+        <w:rPr>
+          <w:b/>
+          <w:bCs/>
+        </w:rPr>
+        <w:t>class</w:t>
+      </w:r>
+      <w:r>
+        <w:t xml:space="preserve"> B2CCompaniesAgain </w:t>
+      </w:r>
+      <w:r>
+        <w:rPr>
+          <w:b/>
+          <w:bCs/>
+        </w:rPr>
+        <w:t>implements</w:t>
+      </w:r>
+      <w:r>
+        <w:t xml:space="preserve"> ISellingSystem2 {</w:t>
+      </w:r>
+    </w:p>
+    <w:p>
+      <w:r>
+        <w:tab/>
+        <w:t>@Override</w:t>
+      </w:r>
+    </w:p>
+    <w:p>
+      <w:r>
+        <w:tab/>
+      </w:r>
+      <w:r>
+        <w:rPr>
+          <w:b/>
+          <w:bCs/>
+        </w:rPr>
+        <w:t>public</w:t>
+      </w:r>
+      <w:r>
+        <w:t xml:space="preserve"> </w:t>
+      </w:r>
+      <w:r>
+        <w:rPr>
+          <w:b/>
+          <w:bCs/>
+        </w:rPr>
+        <w:t>void</w:t>
+      </w:r>
+      <w:r>
+        <w:t xml:space="preserve"> sales2() {</w:t>
+      </w:r>
+    </w:p>
+    <w:p>
+      <w:r>
+        <w:tab/>
+      </w:r>
+      <w:r>
+        <w:tab/>
+      </w:r>
+      <w:proofErr w:type="spellStart"/>
+      <w:r>
+        <w:t>System.</w:t>
+      </w:r>
+      <w:r>
+        <w:rPr>
+          <w:b/>
+          <w:bCs/>
+          <w:i/>
+          <w:iCs/>
+        </w:rPr>
+        <w:t>out</w:t>
+      </w:r>
+      <w:r>
+        <w:t>.println</w:t>
+      </w:r>
+      <w:proofErr w:type="spellEnd"/>
+      <w:r>
+        <w:t>("B2CCompanies.sales2()");</w:t>
+      </w:r>
+    </w:p>
+    <w:p>
+      <w:r>
+        <w:tab/>
+        <w:t>}</w:t>
+      </w:r>
+    </w:p>
+    <w:p/>
+    <w:p>
+      <w:r>
+        <w:tab/>
+        <w:t>@Override</w:t>
+      </w:r>
+    </w:p>
+    <w:p>
+      <w:r>
+        <w:tab/>
+      </w:r>
+      <w:r>
+        <w:rPr>
+          <w:b/>
+          <w:bCs/>
+        </w:rPr>
+        <w:t>public</w:t>
+      </w:r>
+      <w:r>
+        <w:t xml:space="preserve"> </w:t>
+      </w:r>
+      <w:r>
+        <w:rPr>
+          <w:b/>
+          <w:bCs/>
+        </w:rPr>
+        <w:t>void</w:t>
+      </w:r>
+      <w:r>
+        <w:t xml:space="preserve"> marketing2() {</w:t>
+      </w:r>
+    </w:p>
+    <w:p>
+      <w:r>
+        <w:tab/>
+      </w:r>
+      <w:r>
+        <w:tab/>
+      </w:r>
+      <w:proofErr w:type="spellStart"/>
+      <w:r>
+        <w:t>System.</w:t>
+      </w:r>
+      <w:r>
+        <w:rPr>
+          <w:b/>
+          <w:bCs/>
+          <w:i/>
+          <w:iCs/>
+        </w:rPr>
+        <w:t>out</w:t>
+      </w:r>
+      <w:r>
+        <w:t>.println</w:t>
+      </w:r>
+      <w:proofErr w:type="spellEnd"/>
+      <w:r>
+        <w:t>("B2CCompanies.marketing2()");</w:t>
+      </w:r>
+    </w:p>
+    <w:p>
+      <w:r>
+        <w:tab/>
+      </w:r>
+      <w:r>
+        <w:tab/>
+        <w:t>ISellingSystem2.</w:t>
+      </w:r>
+      <w:r>
+        <w:rPr>
+          <w:i/>
+          <w:iCs/>
+        </w:rPr>
+        <w:t>networkingSkills2</w:t>
+      </w:r>
+      <w:r>
+        <w:t>();</w:t>
+      </w:r>
+    </w:p>
+    <w:p>
+      <w:r>
+        <w:tab/>
+        <w:t>}</w:t>
+      </w:r>
+    </w:p>
+    <w:p>
+      <w:r>
+        <w:t>}</w:t>
+      </w:r>
+    </w:p>
+    <w:p/>
+    <w:p>
+      <w:r>
+        <w:rPr>
+          <w:b/>
+          <w:bCs/>
+        </w:rPr>
+        <w:t>public</w:t>
+      </w:r>
+      <w:r>
+        <w:t xml:space="preserve"> </w:t>
+      </w:r>
+      <w:r>
+        <w:rPr>
+          <w:b/>
+          <w:bCs/>
+        </w:rPr>
+        <w:t>class</w:t>
+      </w:r>
+      <w:r>
+        <w:t xml:space="preserve"> </w:t>
+      </w:r>
+      <w:proofErr w:type="spellStart"/>
+      <w:r>
+        <w:t>FixingInterfaceIssues</w:t>
+      </w:r>
+      <w:proofErr w:type="spellEnd"/>
+      <w:r>
+        <w:t xml:space="preserve"> {</w:t>
+      </w:r>
+    </w:p>
+    <w:p/>
+    <w:p>
+      <w:r>
+        <w:t>}</w:t>
+      </w:r>
+    </w:p>
+    <w:p>
+      <w:pPr>
+        <w:pBdr>
+          <w:bottom w:val="single" w:sz="6" w:space="1" w:color="auto"/>
+        </w:pBdr>
+      </w:pPr>
+    </w:p>
     <w:p/>
     <w:p/>
     <w:p/>

</xml_diff>